<commit_message>
Lint clean, prose pass, and narrowly scoped ruff exemptions
Ruff clean across src, scripts, tests, and the manuscript build. The four
remaining exemptions are documented in pyproject.toml rather than worked
around; the substantive one is that `x == True` is not redundant on a pandas
nullable boolean column, where `is True` is wrong and bare truthiness folds
"unclassified" silently into "not empirical".

Prose: removed every em-dash per the author's standing style rule and recast
the appositives that the substitution left reading as comma pile-ups.

Co-Authored-By: Claude Opus 5 <noreply@anthropic.com>
Claude-Session: https://claude.ai/code/session_011Zub5QBfsM1YXE22ff7hbP
</commit_message>
<xml_diff>
--- a/manuscript/SRED_manuscript.docx
+++ b/manuscript/SRED_manuscript.docx
@@ -352,7 +352,7 @@
           <w:sz w:val="22"/>
           <w:szCs w:val="22"/>
         </w:rPr>
-        <w:t xml:space="preserve"> We integrated PubMed/MEDLINE, Europe PMC, and OpenAlex into a deduplicated corpus of suicide-focused scholarship published between 1989 and 2025, combining complete venue-based capture of dedicated suicidology journals with a title-based topical sweep across all other venues. A three-stage classifier, trained by distant supervision on human National Library of Medicine indexing and validated against withheld human labels, categorized each abstract by communication type, empirical status, and research methodology. We additionally extracted suicide-specific fields absent from every existing bibliographic database: position on the prevention continuum, suicide-related outcome construct, study population, study design, lethal means focus, and social determinants of health.</w:t>
+        <w:t xml:space="preserve"> We integrated PubMed/MEDLINE, Europe PMC, and OpenAlex into a deduplicated corpus of suicide-focused scholarship published between 1989 and 2025, combining complete venue-based capture of dedicated suicidology journals with a title-based topical sweep across all other venues. A three-stage classifier trained by distant supervision on human National Library of Medicine indexing, and validated against withheld human labels, categorized each abstract by communication type, empirical status, and research methodology. We additionally extracted suicide-specific fields absent from every existing bibliographic database: position on the prevention continuum, suicide-related outcome construct, study population, study design, lethal means focus, and social determinants of health.</w:t>
       </w:r>
     </w:p>
     <w:p>
@@ -501,24 +501,24 @@
           <w:sz w:val="22"/>
           <w:szCs w:val="22"/>
         </w:rPr>
-        <w:t xml:space="preserve">These questions have well-established answers in other disciplines because those disciplines built infrastructure to answer them. Scientometric analysis, the systematic study of publication patterns, citation networks, collaboration structures, and thematic evolution, has become a routine instrument of disciplinary self-examination [@haghani2023; @waltman2022]. Its value is practical rather than merely reflective: it identifies underexplored areas, documents methodological shifts, reveals who participates in knowledge production, and supplies evidence for strategic decisions about research priorities.</w:t>
-      </w:r>
-    </w:p>
-    <w:p>
-      <w:pPr>
-        <w:spacing w:after="0" w:line="480" w:lineRule="auto"/>
-      </w:pPr>
-      <w:r>
-        <w:rPr>
-          <w:rFonts w:ascii="Arial" w:cs="Arial" w:eastAsia="Arial" w:hAnsi="Arial"/>
-          <w:b w:val="false"/>
-          <w:bCs w:val="false"/>
-          <w:i w:val="false"/>
-          <w:iCs w:val="false"/>
-          <w:sz w:val="22"/>
-          <w:szCs w:val="22"/>
-        </w:rPr>
-        <w:t xml:space="preserve">Social work offers a recent and instructive example. Perron, Victor, and Qi [-@perron2026] constructed a comprehensive bibliographic database of 62,602 articles from 88 social work journals spanning 1989 to 2025, applied a small language model to classify abstracts by empirical status and methodology, and documented the discipline's transformation: empirical research rose from 43% to 72% of publications, methodology shifted from quantitative dominance toward pluralism, mean authors per article nearly doubled, and 17.5% of articles remained uncited. Their contribution was as much infrastructural as substantive, a maintainable, extensible database enabling questions no single study had previously been positioned to ask.</w:t>
+        <w:t xml:space="preserve">These questions have well-established answers in other disciplines because those disciplines built infrastructure to answer them. Scientometric analysis (the systematic study of publication patterns, citation networks, collaboration structures, and thematic evolution) has become a routine instrument of disciplinary self-examination [@haghani2023; @waltman2022]. Its value is practical rather than merely reflective: it identifies underexplored areas, documents methodological shifts, reveals who participates in knowledge production, and supplies evidence for strategic decisions about research priorities.</w:t>
+      </w:r>
+    </w:p>
+    <w:p>
+      <w:pPr>
+        <w:spacing w:after="0" w:line="480" w:lineRule="auto"/>
+      </w:pPr>
+      <w:r>
+        <w:rPr>
+          <w:rFonts w:ascii="Arial" w:cs="Arial" w:eastAsia="Arial" w:hAnsi="Arial"/>
+          <w:b w:val="false"/>
+          <w:bCs w:val="false"/>
+          <w:i w:val="false"/>
+          <w:iCs w:val="false"/>
+          <w:sz w:val="22"/>
+          <w:szCs w:val="22"/>
+        </w:rPr>
+        <w:t xml:space="preserve">Social work offers a recent and instructive example. Perron, Victor, and Qi [-@perron2026] constructed a comprehensive bibliographic database of 62,602 articles from 88 social work journals spanning 1989 to 2025, applied a small language model to classify abstracts by empirical status and methodology, and documented the discipline's transformation: empirical research rose from 43% to 72% of publications, methodology shifted from quantitative dominance toward pluralism, mean authors per article nearly doubled, and 17.5% of articles remained uncited. Their contribution was as much infrastructural as substantive: a maintainable, extensible database enabling questions no single study had previously been positioned to ask.</w:t>
       </w:r>
     </w:p>
     <w:p>
@@ -1011,7 +1011,7 @@
           <w:sz w:val="22"/>
           <w:szCs w:val="22"/>
         </w:rPr>
-        <w:t xml:space="preserve"> no bibliographic database carries: position on the public-health prevention continuum, suicide-related outcome construct, study population, study design, lethal means focus, and social determinants of health. These are what convert a bibliographic resource into an instrument for prevention science, they permit the question of whether the field's research effort is distributed where suicide deaths actually occur.</w:t>
+        <w:t xml:space="preserve"> no bibliographic database carries: position on the public-health prevention continuum, suicide-related outcome construct, study population, study design, lethal means focus, and social determinants of health. These are what convert a bibliographic resource into an instrument for prevention science: they permit the question of whether the field's research effort is distributed where suicide deaths actually occur.</w:t>
       </w:r>
     </w:p>
     <w:p>
@@ -1782,7 +1782,7 @@
           <w:sz w:val="22"/>
           <w:szCs w:val="22"/>
         </w:rPr>
-        <w:t xml:space="preserve"> Records were collapsed through a cascade: DOI match, then PMID match, then blocked fuzzy title matching for records carrying neither identifier. Fuzzy candidates were blocked on publication year and first significant title token, then scored by Levenshtein-based token-sort ratio; pairs at or above 90% similarity were merged and pairs between 80% and 90% were written to a review file rather than resolved silently. Two additional guards proved necessary and are worth stating, because their absence produces confidently wrong counts: records carrying conflicting persistent identifiers were never merged regardless of title similarity, and a title match alone was insufficient for merging without corroboration from ISSN, journal string, or first-author surname. Editorials and commentaries reuse titles across venues, and generic titles recur within a year. Merging was field-wise and provenance-aware: where sources disagreed, the value was taken from the source with the better record for that field, PubMed for abstracts and MeSH, OpenAlex for citation counts, ORCID, and institutional affiliations.</w:t>
+        <w:t xml:space="preserve"> Records were collapsed through a cascade: DOI match, then PMID match, then blocked fuzzy title matching for records carrying neither identifier. Fuzzy candidates were blocked on publication year and first significant title token, then scored by Levenshtein-based token-sort ratio; pairs at or above 90% similarity were merged and pairs between 80% and 90% were written to a review file rather than resolved silently. Two additional guards proved necessary and are worth stating, because their absence produces confidently wrong counts: records carrying conflicting persistent identifiers were never merged regardless of title similarity, and a title match alone was insufficient for merging without corroboration from ISSN, journal string, or first-author surname. Editorials and commentaries reuse titles across venues, and generic titles recur within a year. Merging was field-wise and provenance-aware: where sources disagreed, the value was taken from the source with the better record for that field (PubMed for abstracts and MeSH; OpenAlex for citation counts, ORCID, and institutional affiliations).</w:t>
       </w:r>
     </w:p>
     <w:p>
@@ -1848,7 +1848,7 @@
           <w:sz w:val="22"/>
           <w:szCs w:val="22"/>
         </w:rPr>
-        <w:t xml:space="preserve"> attempt author disambiguation, for the same reason Perron and colleagues did not, it requires an entity-resolution system beyond the scope of database construction, and a partial job produces confidently wrong collaboration networks. ORCID is the only author identifier treated as authoritative.</w:t>
+        <w:t xml:space="preserve"> attempt author disambiguation, for the same reason Perron and colleagues did not. It requires an entity-resolution system beyond the scope of database construction, and a partial job produces confidently wrong collaboration networks. ORCID is the only author identifier treated as authoritative.</w:t>
       </w:r>
     </w:p>
     <w:p>
@@ -2035,7 +2035,7 @@
           <w:sz w:val="22"/>
           <w:szCs w:val="22"/>
         </w:rPr>
-        <w:t xml:space="preserve">. NLM PublicationType tags are assigned by trained indexers and supply high-quality labels for a substantial share of records at zero annotation cost. We used those labels to train a calibrated linear text classifier (TF-IDF with word 1–2 grams, regularized logistic regression, sigmoid calibration) and applied it to the unindexed remainder. On abstract-length text with tens of thousands of labeled examples, this approach performs comparably to a fine-tuned encoder for document-type classification while training in seconds on CPU, remaining fully deterministic, and, critically for a methods paper, remaining inspectable: any prediction traces to weighted n-grams.</w:t>
+        <w:t xml:space="preserve">. NLM PublicationType tags are assigned by trained indexers and supply high-quality labels for a substantial share of records at zero annotation cost. We used those labels to train a calibrated linear text classifier (TF-IDF with word 1–2 grams, regularized logistic regression, sigmoid calibration) and applied it to the unindexed remainder. On abstract-length text with tens of thousands of labeled examples, this approach performs comparably to a fine-tuned encoder for document-type classification while training in seconds on CPU, remaining fully deterministic, and, critically for a methods paper, remaining inspectable, since any prediction traces to weighted n-grams.</w:t>
       </w:r>
     </w:p>
     <w:p>
@@ -3426,7 +3426,7 @@
           <w:sz w:val="22"/>
           <w:szCs w:val="22"/>
         </w:rPr>
-        <w:t xml:space="preserve">Suicide research output grew at 6.48% annually. Comparison against de Solla Price's foundational benchmark of 4.7% for the scientific literature overall, and against the 4.91% Perron and colleagues report for social work, situates the field within general dynamics of scientific expansion rather than marking it as exceptional. More informative than the headline rate is the mechanism. Journals publishing suicide research grew at 4.63% annually against 6.48% for articles, a differential of only 1.85 points. Social work's corresponding figures were 4.91% and 2.44%, a differential of 2.47 points in the opposite direction. Social work grew by publishing more in the journals it already had; suicide research grew by spreading into journals that had not previously published it, from 326 venues in 1989 to 1,518 in 2023. Consolidation and dispersion are different kinds of growth, and they leave a field in very different shape.</w:t>
+        <w:t xml:space="preserve">Suicide research output grew at 6.48% annually. Comparison against de Solla Price's foundational benchmark of 4.7% for the scientific literature overall, and against the 4.91% Perron and colleagues report for social work, situates the field within the general dynamics of scientific expansion rather than marking it as exceptional. More informative than the headline rate is the mechanism. Journals publishing suicide research grew at 4.63% annually against 6.48% for articles, a differential of only 1.85 points. Social work's corresponding figures were 4.91% and 2.44%, a differential of 2.47 points in the opposite direction. Social work grew by publishing more in the journals it already had; suicide research grew by spreading into journals that had not previously published it, from 326 venues in 1989 to 1,518 in 2023. Consolidation and dispersion are different kinds of growth, and they leave a field in very different shape.</w:t>
       </w:r>
     </w:p>
     <w:p>
@@ -3616,7 +3616,7 @@
           <w:sz w:val="22"/>
           <w:szCs w:val="22"/>
         </w:rPr>
-        <w:t xml:space="preserve">This has practical consequences. A clinician or researcher who reads the specialty journals sees a minority of the field. Methodological conventions, how ideation is measured, how attempts are ascertained, how risk is modeled, develop semi-independently within host disciplines and drift apart, which is one plausible source of the measurement heterogeneity that frustrates meta-analysis. Systematic reviews searching a single database systematically miss material, and the 56.76% single-source rate we observe puts a number on that risk. And a dispersed field has weaker mechanisms for collective self-correction: there is no venue where the whole literature is visible to itself.</w:t>
+        <w:t xml:space="preserve">This has practical consequences. A clinician or researcher who reads the specialty journals sees a minority of the field. Methodological conventions (how ideation is measured, how attempts are ascertained, how risk is modeled) develop semi-independently within host disciplines and drift apart, which is one plausible source of the measurement heterogeneity that frustrates meta-analysis. Systematic reviews searching a single database systematically miss material, and the 56.76% single-source rate we observe puts a number on that risk. And a dispersed field has weaker mechanisms for collective self-correction: there is no venue where the whole literature is visible to itself.</w:t>
       </w:r>
     </w:p>
     <w:p>
@@ -3786,7 +3786,7 @@
           <w:sz w:val="22"/>
           <w:szCs w:val="22"/>
         </w:rPr>
-        <w:t xml:space="preserve"> Where a corpus carries human-assigned controlled vocabulary, that indexing can supervise a text classifier at zero annotation cost and simultaneously provide validation at a scale hand-coding cannot reach. This is cheaper than LLM classification, reproducible without specialized hardware, inspectable, and validated against human judgment on tens of thousands of records rather than a hundred. Where MEDLINE indexing is absent, much of the social-science literature, the LLM path remains available and is shipped with the pipeline.</w:t>
+        <w:t xml:space="preserve"> Where a corpus carries human-assigned controlled vocabulary, that indexing can supervise a text classifier at zero annotation cost and simultaneously provide validation at a scale hand-coding cannot reach. This is cheaper than LLM classification, reproducible without specialized hardware, inspectable, and validated against human judgment on tens of thousands of records rather than a hundred. Where MEDLINE indexing is absent (much of the social-science literature), the LLM path remains available and is shipped with the pipeline.</w:t>
       </w:r>
     </w:p>
     <w:p>
@@ -3902,7 +3902,7 @@
           <w:sz w:val="22"/>
           <w:szCs w:val="22"/>
         </w:rPr>
-        <w:t xml:space="preserve"> The OpenAlex topical channel is complete only for 1989–2000 in this release. More fundamentally, all three sources under-represent non-English-language scholarship and journals from low- and middle-income countries, precisely the settings bearing the greatest suicide burden. Any statement here about the global distribution of suicide research is a statement about the indexed, largely English-language literature.</w:t>
+        <w:t xml:space="preserve"> The OpenAlex topical channel is complete only for 1989–2000 in this release. More fundamentally, all three sources under-represent non-English-language scholarship and journals from low- and middle-income countries, which are precisely the settings bearing the greatest suicide burden. Any statement here about the global distribution of suicide research is a statement about the indexed, largely English-language literature.</w:t>
       </w:r>
     </w:p>
     <w:p>
@@ -3949,7 +3949,7 @@
           <w:sz w:val="22"/>
           <w:szCs w:val="22"/>
         </w:rPr>
-        <w:t xml:space="preserve"> field permits any analysis to be restricted to human-labeled records, and we recommend that any result that matters be checked that way. Abstract-based classification also cannot see what abstracts omit, a study's design is sometimes clearer in its methods section than in its abstract.</w:t>
+        <w:t xml:space="preserve"> field permits any analysis to be restricted to human-labeled records, and we recommend that any result that matters be checked that way. Abstract-based classification also cannot see what abstracts omit: a study's design is sometimes clearer in its methods section than in its abstract.</w:t>
       </w:r>
     </w:p>
     <w:p>
@@ -4192,7 +4192,7 @@
           <w:sz w:val="22"/>
           <w:szCs w:val="22"/>
         </w:rPr>
-        <w:t xml:space="preserve">Suicide research is growing at rates matching science overall, has become predominantly empirical, is increasingly collaborative, and remains methodologically concentrated in quantitative approaches. It is also structurally dispersed: the substantial majority of its output appears outside its own specialty journals, which shapes how its evidence accumulates, how its methods converge, and how reliably it can be synthesized. The Suicide Research Evidence Database makes these patterns visible and, being fully open and reproducible, makes them re-checkable by anyone. The field's most consequential open question is not how much it produces but whether that production is distributed where suicide deaths actually occur, and that question is now answerable.</w:t>
+        <w:t xml:space="preserve">Suicide research is growing at rates matching science overall, has become predominantly empirical, is increasingly collaborative, and remains methodologically concentrated in quantitative approaches. It is also structurally dispersed. The substantial majority of its output appears outside its own specialty journals, which shapes how its evidence accumulates, how its methods converge, and how reliably it can be synthesized. The Suicide Research Evidence Database makes these patterns visible and, being fully open and reproducible, makes them re-checkable by anyone. The field's most consequential open question is not how much it produces, but whether that production is distributed where suicide deaths actually occur. That question is now answerable.</w:t>
       </w:r>
     </w:p>
     <w:p>

</xml_diff>

<commit_message>
Cite the repository in the manuscript
Three placements rather than one. The formal availability statement in
Declarations now names the licences, explains why abstracts are withheld from
redistribution and how to recover them, and points at the CI and verification
machinery, since a reproducibility claim a reviewer cannot check is not worth
much. The Introduction carries the URL alongside the study objectives so a
reader meets the artefact before the Method. The corpus-definition paragraph
links the config files it already referenced by name.

Co-Authored-By: Claude Opus 5 <noreply@anthropic.com>
Claude-Session: https://claude.ai/code/session_011Zub5QBfsM1YXE22ff7hbP
</commit_message>
<xml_diff>
--- a/manuscript/SRED_manuscript.docx
+++ b/manuscript/SRED_manuscript.docx
@@ -1028,6 +1028,23 @@
           <w:sz w:val="22"/>
           <w:szCs w:val="22"/>
         </w:rPr>
+        <w:t xml:space="preserve">The database, the pipeline that builds it, and the source of this manuscript are openly available at https://github.com/yunyu118/suicide-research-evidence-database.</w:t>
+      </w:r>
+    </w:p>
+    <w:p>
+      <w:pPr>
+        <w:spacing w:after="0" w:line="480" w:lineRule="auto"/>
+      </w:pPr>
+      <w:r>
+        <w:rPr>
+          <w:rFonts w:ascii="Arial" w:cs="Arial" w:eastAsia="Arial" w:hAnsi="Arial"/>
+          <w:b w:val="false"/>
+          <w:bCs w:val="false"/>
+          <w:i w:val="false"/>
+          <w:iCs w:val="false"/>
+          <w:sz w:val="22"/>
+          <w:szCs w:val="22"/>
+        </w:rPr>
         <w:t xml:space="preserve">We report four objectives. (1) Document the construction of an open, reproducible bibliographic infrastructure for suicide research. (2) Implement and validate a classification approach that does not require a GPU and that can be audited against human indexing. (3) Characterize growth, empiricism, methodology, collaboration, and citation patterns from 1989 to 2025. (4) Quantify the field's structural dispersion and the distribution of its research effort across prevention levels, populations, and social determinants.</w:t>
       </w:r>
     </w:p>
@@ -1452,7 +1469,7 @@
           <w:sz w:val="22"/>
           <w:szCs w:val="22"/>
         </w:rPr>
-        <w:t xml:space="preserve"> in the project repository, and the resolved journal list is in </w:t>
+        <w:t xml:space="preserve"> in the project repository (https://github.com/yunyu118/suicide-research-evidence-database), and the resolved journal list is in </w:t>
       </w:r>
       <w:r>
         <w:rPr>
@@ -2570,7 +2587,27 @@
           <w:sz w:val="22"/>
           <w:szCs w:val="22"/>
         </w:rPr>
-        <w:t xml:space="preserve"> into a machine-readable results file, from which this manuscript's figures are substituted at build time. An independent verification script re-derives each claim from the corpus using separately written code and fails the build on any mismatch.</w:t>
+        <w:t xml:space="preserve"> into a machine-readable results file (</w:t>
+      </w:r>
+      <w:r>
+        <w:rPr>
+          <w:rFonts w:ascii="Courier New" w:cs="Courier New" w:eastAsia="Courier New" w:hAnsi="Courier New"/>
+          <w:sz w:val="20"/>
+          <w:szCs w:val="20"/>
+        </w:rPr>
+        <w:t xml:space="preserve">data/processed/results.json</w:t>
+      </w:r>
+      <w:r>
+        <w:rPr>
+          <w:rFonts w:ascii="Arial" w:cs="Arial" w:eastAsia="Arial" w:hAnsi="Arial"/>
+          <w:b w:val="false"/>
+          <w:bCs w:val="false"/>
+          <w:i w:val="false"/>
+          <w:iCs w:val="false"/>
+          <w:sz w:val="22"/>
+          <w:szCs w:val="22"/>
+        </w:rPr>
+        <w:t xml:space="preserve"> in the repository), from which this manuscript's figures are substituted at build time. An independent verification script re-derives each claim from the corpus using separately written code and fails the build on any mismatch.</w:t>
       </w:r>
     </w:p>
     <w:p>
@@ -4253,7 +4290,7 @@
           <w:sz w:val="22"/>
           <w:szCs w:val="22"/>
         </w:rPr>
-        <w:t xml:space="preserve"> All code, configuration, derived data, and the complete DuckDB database are available at [repository URL] under MIT (code) and CC BY 4.0 (data). The build is reproducible end to end with five commands; see </w:t>
+        <w:t xml:space="preserve"> The complete pipeline, configuration, derived data tables, figures, and this manuscript's build system are openly available at https://github.com/yunyu118/suicide-research-evidence-database (code under MIT, data under CC BY 4.0). The repository includes an abstract-free release of all 96,641 records as Parquet; the full relational database is distributed as a DuckDB release asset, and abstracts are omitted from redistribution for copyright reasons but can be re-fetched for every record from the DOIs and PMIDs retained in the release. The build is reproducible end to end with six commands and no institutional subscription; see </w:t>
       </w:r>
       <w:r>
         <w:rPr>
@@ -4273,7 +4310,27 @@
           <w:sz w:val="22"/>
           <w:szCs w:val="22"/>
         </w:rPr>
-        <w:t xml:space="preserve">.</w:t>
+        <w:t xml:space="preserve">. Continuous integration runs the full pipeline against a synthetic fixture corpus on every commit, and </w:t>
+      </w:r>
+      <w:r>
+        <w:rPr>
+          <w:rFonts w:ascii="Courier New" w:cs="Courier New" w:eastAsia="Courier New" w:hAnsi="Courier New"/>
+          <w:sz w:val="20"/>
+          <w:szCs w:val="20"/>
+        </w:rPr>
+        <w:t xml:space="preserve">scripts/05_verify.py</w:t>
+      </w:r>
+      <w:r>
+        <w:rPr>
+          <w:rFonts w:ascii="Arial" w:cs="Arial" w:eastAsia="Arial" w:hAnsi="Arial"/>
+          <w:b w:val="false"/>
+          <w:bCs w:val="false"/>
+          <w:i w:val="false"/>
+          <w:iCs w:val="false"/>
+          <w:sz w:val="22"/>
+          <w:szCs w:val="22"/>
+        </w:rPr>
+        <w:t xml:space="preserve"> independently re-derives each numeric claim in this manuscript from the corpus and fails the build on any mismatch.</w:t>
       </w:r>
     </w:p>
     <w:p>

</xml_diff>